<commit_message>
docs: Decison-log for model decision added
</commit_message>
<xml_diff>
--- a/Decision Logs/Decision_Log_Entry_1_Updated.docx
+++ b/Decision Logs/Decision_Log_Entry_1_Updated.docx
@@ -226,13 +226,7 @@
         <w:rPr>
           <w:lang w:val="en-GB"/>
         </w:rPr>
-        <w:t xml:space="preserve">Some projects such as </w:t>
-      </w:r>
-      <w:r>
-        <w:rPr>
-          <w:lang w:val="en-GB"/>
-        </w:rPr>
-        <w:t xml:space="preserve"> ‘</w:t>
+        <w:t>Some projects such as  ‘</w:t>
       </w:r>
       <w:r>
         <w:rPr>
@@ -306,19 +300,7 @@
         <w:rPr>
           <w:lang w:val="en-GB"/>
         </w:rPr>
-        <w:t xml:space="preserve">, which focuses more on model </w:t>
-      </w:r>
-      <w:r>
-        <w:rPr>
-          <w:lang w:val="en-GB"/>
-        </w:rPr>
-        <w:t>behaviour</w:t>
-      </w:r>
-      <w:r>
-        <w:rPr>
-          <w:lang w:val="en-GB"/>
-        </w:rPr>
-        <w:t xml:space="preserve"> and evaluation.</w:t>
+        <w:t>, which focuses more on model behaviour and evaluation.</w:t>
       </w:r>
     </w:p>
     <w:p>
@@ -394,11 +376,6 @@
       </w:hyperlink>
     </w:p>
     <w:p>
-      <w:pPr>
-        <w:rPr>
-          <w:lang w:val="en-GB"/>
-        </w:rPr>
-      </w:pPr>
       <w:r>
         <w:rPr>
           <w:b/>
@@ -412,7 +389,10 @@
           <w:lang w:val="en-GB"/>
         </w:rPr>
         <w:br/>
-        <w:t>This project allows me to experiment with different LLM models and evaluate their answers.</w:t>
+        <w:t xml:space="preserve">This project allows me to experiment with different LLM models and evaluate their </w:t>
+      </w:r>
+      <w:r>
+        <w:t>answers.</w:t>
       </w:r>
     </w:p>
     <w:p>
@@ -1532,6 +1512,7 @@
   <w:style w:type="character" w:default="1" w:styleId="DefaultParagraphFont">
     <w:name w:val="Default Paragraph Font"/>
     <w:uiPriority w:val="1"/>
+    <w:semiHidden/>
     <w:unhideWhenUsed/>
   </w:style>
   <w:style w:type="table" w:default="1" w:styleId="TableNormal">

</xml_diff>